<commit_message>
Remove temp Office file and update DOCX
Delete the temporary Office lock file (~$...) and update the 5.12.docx binary in the same directory. This removes a leftover temp file and replaces the main .docx with a new/modified version.
</commit_message>
<xml_diff>
--- a/煤科投稿/煤科论文5.12.docx
+++ b/煤科投稿/煤科论文5.12.docx
@@ -634,7 +634,7 @@
           <w:noProof/>
         </w:rPr>
         <w:drawing>
-          <wp:inline distT="0" distB="0" distL="0" distR="0" wp14:anchorId="4FAC5F3F" wp14:editId="46FACAEB">
+          <wp:inline distT="0" distB="0" distL="0" distR="0" wp14:anchorId="4FAC5F3F" wp14:editId="45BCB1E1">
             <wp:extent cx="5778000" cy="3113112"/>
             <wp:effectExtent l="0" t="0" r="0" b="0"/>
             <wp:docPr id="1462127567" name="图片 22"/>
@@ -3258,9 +3258,6 @@
     <w:p>
       <w:pPr>
         <w:pStyle w:val="15"/>
-        <w:rPr>
-          <w:rFonts w:hint="eastAsia"/>
-        </w:rPr>
       </w:pPr>
       <w:r>
         <w:t xml:space="preserve">Table </w:t>
@@ -10615,9 +10612,6 @@
     <w:p>
       <w:pPr>
         <w:pStyle w:val="15"/>
-        <w:rPr>
-          <w:rFonts w:hint="eastAsia"/>
-        </w:rPr>
       </w:pPr>
       <w:r>
         <w:t>Table 2 Classification criteria of aquifer disturbance levels</w:t>
@@ -11402,9 +11396,6 @@
     <w:p>
       <w:pPr>
         <w:pStyle w:val="15"/>
-        <w:rPr>
-          <w:rFonts w:hint="eastAsia"/>
-        </w:rPr>
       </w:pPr>
       <w:r>
         <w:t>Table 3 Comparison of evaluation results of different mining district planning schemes</w:t>
@@ -11438,6 +11429,7 @@
             <w:pPr>
               <w:pStyle w:val="100"/>
               <w:ind w:firstLineChars="0" w:firstLine="0"/>
+              <w:jc w:val="center"/>
               <w:rPr>
                 <w:b/>
                 <w:bCs/>
@@ -11461,6 +11453,7 @@
             <w:pPr>
               <w:pStyle w:val="100"/>
               <w:ind w:firstLineChars="0" w:firstLine="0"/>
+              <w:jc w:val="center"/>
               <w:rPr>
                 <w:b/>
                 <w:bCs/>
@@ -11491,6 +11484,7 @@
             <w:pPr>
               <w:pStyle w:val="100"/>
               <w:ind w:firstLineChars="0" w:firstLine="0"/>
+              <w:jc w:val="center"/>
               <w:rPr>
                 <w:b/>
                 <w:bCs/>
@@ -11521,6 +11515,7 @@
             <w:pPr>
               <w:pStyle w:val="100"/>
               <w:ind w:firstLineChars="0" w:firstLine="0"/>
+              <w:jc w:val="center"/>
               <w:rPr>
                 <w:b/>
                 <w:bCs/>
@@ -11544,6 +11539,7 @@
             <w:pPr>
               <w:pStyle w:val="100"/>
               <w:ind w:firstLineChars="0" w:firstLine="0"/>
+              <w:jc w:val="center"/>
               <w:rPr>
                 <w:b/>
                 <w:bCs/>
@@ -11595,6 +11591,7 @@
             <w:pPr>
               <w:pStyle w:val="100"/>
               <w:ind w:firstLineChars="0" w:firstLine="0"/>
+              <w:jc w:val="center"/>
               <w:rPr>
                 <w:b/>
                 <w:bCs/>
@@ -11618,6 +11615,7 @@
             <w:pPr>
               <w:pStyle w:val="100"/>
               <w:ind w:firstLineChars="0" w:firstLine="0"/>
+              <w:jc w:val="center"/>
               <w:rPr>
                 <w:b/>
                 <w:bCs/>
@@ -11643,6 +11641,7 @@
             <w:pPr>
               <w:pStyle w:val="100"/>
               <w:ind w:firstLineChars="0" w:firstLine="0"/>
+              <w:jc w:val="center"/>
             </w:pPr>
             <w:r>
               <w:t>工程效率优先方案</w:t>
@@ -11658,6 +11657,7 @@
             <w:pPr>
               <w:pStyle w:val="100"/>
               <w:ind w:firstLineChars="0" w:firstLine="0"/>
+              <w:jc w:val="center"/>
             </w:pPr>
             <w:r>
               <w:t>89.34</w:t>
@@ -11673,6 +11673,7 @@
             <w:pPr>
               <w:pStyle w:val="100"/>
               <w:ind w:firstLineChars="0" w:firstLine="0"/>
+              <w:jc w:val="center"/>
             </w:pPr>
             <w:r>
               <w:t>—</w:t>
@@ -11688,6 +11689,7 @@
             <w:pPr>
               <w:pStyle w:val="100"/>
               <w:ind w:firstLineChars="0" w:firstLine="0"/>
+              <w:jc w:val="center"/>
             </w:pPr>
             <w:r>
               <w:t>—</w:t>
@@ -11703,6 +11705,7 @@
             <w:pPr>
               <w:pStyle w:val="100"/>
               <w:ind w:firstLineChars="0" w:firstLine="0"/>
+              <w:jc w:val="center"/>
             </w:pPr>
             <w:r>
               <w:t>—</w:t>
@@ -11718,6 +11721,7 @@
             <w:pPr>
               <w:pStyle w:val="100"/>
               <w:ind w:firstLineChars="0" w:firstLine="0"/>
+              <w:jc w:val="center"/>
             </w:pPr>
             <w:r>
               <w:t>—</w:t>
@@ -11733,6 +11737,7 @@
             <w:pPr>
               <w:pStyle w:val="100"/>
               <w:ind w:firstLineChars="0" w:firstLine="0"/>
+              <w:jc w:val="center"/>
             </w:pPr>
             <w:r>
               <w:t>工程组织较优，综合表现居中</w:t>
@@ -11750,6 +11755,7 @@
             <w:pPr>
               <w:pStyle w:val="100"/>
               <w:ind w:firstLineChars="0" w:firstLine="0"/>
+              <w:jc w:val="center"/>
             </w:pPr>
             <w:r>
               <w:t>资源回收优先方案</w:t>
@@ -11765,6 +11771,7 @@
             <w:pPr>
               <w:pStyle w:val="100"/>
               <w:ind w:firstLineChars="0" w:firstLine="0"/>
+              <w:jc w:val="center"/>
             </w:pPr>
             <w:r>
               <w:t>98.52</w:t>
@@ -11780,6 +11787,7 @@
             <w:pPr>
               <w:pStyle w:val="100"/>
               <w:ind w:firstLineChars="0" w:firstLine="0"/>
+              <w:jc w:val="center"/>
             </w:pPr>
             <w:r>
               <w:t>—</w:t>
@@ -11795,6 +11803,7 @@
             <w:pPr>
               <w:pStyle w:val="100"/>
               <w:ind w:firstLineChars="0" w:firstLine="0"/>
+              <w:jc w:val="center"/>
             </w:pPr>
             <w:r>
               <w:t>—</w:t>
@@ -11810,6 +11819,7 @@
             <w:pPr>
               <w:pStyle w:val="100"/>
               <w:ind w:firstLineChars="0" w:firstLine="0"/>
+              <w:jc w:val="center"/>
             </w:pPr>
             <w:r>
               <w:t>—</w:t>
@@ -11825,6 +11835,7 @@
             <w:pPr>
               <w:pStyle w:val="100"/>
               <w:ind w:firstLineChars="0" w:firstLine="0"/>
+              <w:jc w:val="center"/>
             </w:pPr>
             <w:r>
               <w:t>—</w:t>
@@ -11840,6 +11851,7 @@
             <w:pPr>
               <w:pStyle w:val="100"/>
               <w:ind w:firstLineChars="0" w:firstLine="0"/>
+              <w:jc w:val="center"/>
             </w:pPr>
             <w:r>
               <w:t>覆盖率最高，但扰动水平相对较高</w:t>
@@ -11857,6 +11869,7 @@
             <w:pPr>
               <w:pStyle w:val="100"/>
               <w:ind w:firstLineChars="0" w:firstLine="0"/>
+              <w:jc w:val="center"/>
             </w:pPr>
             <w:r>
               <w:t>低扰动优先方案</w:t>
@@ -11872,6 +11885,7 @@
             <w:pPr>
               <w:pStyle w:val="100"/>
               <w:ind w:firstLineChars="0" w:firstLine="0"/>
+              <w:jc w:val="center"/>
             </w:pPr>
             <w:r>
               <w:t>80.67</w:t>
@@ -11887,6 +11901,7 @@
             <w:pPr>
               <w:pStyle w:val="100"/>
               <w:ind w:firstLineChars="0" w:firstLine="0"/>
+              <w:jc w:val="center"/>
             </w:pPr>
             <w:r>
               <w:t>0.4416</w:t>
@@ -11902,6 +11917,7 @@
             <w:pPr>
               <w:pStyle w:val="100"/>
               <w:ind w:firstLineChars="0" w:firstLine="0"/>
+              <w:jc w:val="center"/>
             </w:pPr>
             <w:r>
               <w:t>0.6353</w:t>
@@ -11917,6 +11933,7 @@
             <w:pPr>
               <w:pStyle w:val="100"/>
               <w:ind w:firstLineChars="0" w:firstLine="0"/>
+              <w:jc w:val="center"/>
             </w:pPr>
             <w:r>
               <w:t>—</w:t>
@@ -11932,6 +11949,7 @@
             <w:pPr>
               <w:pStyle w:val="100"/>
               <w:ind w:firstLineChars="0" w:firstLine="0"/>
+              <w:jc w:val="center"/>
             </w:pPr>
             <w:r>
               <w:t>—</w:t>
@@ -11947,6 +11965,7 @@
             <w:pPr>
               <w:pStyle w:val="100"/>
               <w:ind w:firstLineChars="0" w:firstLine="0"/>
+              <w:jc w:val="center"/>
             </w:pPr>
             <w:r>
               <w:t>扰动控制效果较好，但资源覆盖率较低</w:t>
@@ -11964,6 +11983,7 @@
             <w:pPr>
               <w:pStyle w:val="100"/>
               <w:ind w:firstLineChars="0" w:firstLine="0"/>
+              <w:jc w:val="center"/>
             </w:pPr>
             <w:r>
               <w:t>综合权重调节方案</w:t>
@@ -11979,6 +11999,7 @@
             <w:pPr>
               <w:pStyle w:val="100"/>
               <w:ind w:firstLineChars="0" w:firstLine="0"/>
+              <w:jc w:val="center"/>
             </w:pPr>
             <w:r>
               <w:t>—</w:t>
@@ -11994,6 +12015,7 @@
             <w:pPr>
               <w:pStyle w:val="100"/>
               <w:ind w:firstLineChars="0" w:firstLine="0"/>
+              <w:jc w:val="center"/>
             </w:pPr>
             <w:r>
               <w:t>—</w:t>
@@ -12009,6 +12031,7 @@
             <w:pPr>
               <w:pStyle w:val="100"/>
               <w:ind w:firstLineChars="0" w:firstLine="0"/>
+              <w:jc w:val="center"/>
             </w:pPr>
             <w:r>
               <w:t>—</w:t>
@@ -12024,6 +12047,7 @@
             <w:pPr>
               <w:pStyle w:val="100"/>
               <w:ind w:firstLineChars="0" w:firstLine="0"/>
+              <w:jc w:val="center"/>
             </w:pPr>
             <w:r>
               <w:t>—</w:t>
@@ -12039,6 +12063,7 @@
             <w:pPr>
               <w:pStyle w:val="100"/>
               <w:ind w:firstLineChars="0" w:firstLine="0"/>
+              <w:jc w:val="center"/>
             </w:pPr>
             <w:r>
               <w:t>—</w:t>
@@ -12054,6 +12079,7 @@
             <w:pPr>
               <w:pStyle w:val="100"/>
               <w:ind w:firstLineChars="0" w:firstLine="0"/>
+              <w:jc w:val="center"/>
             </w:pPr>
             <w:r>
               <w:t>在资源覆盖与扰动控制之间折中</w:t>
@@ -15793,6 +15819,7 @@
   <w:style w:type="character" w:default="1" w:styleId="a1">
     <w:name w:val="Default Paragraph Font"/>
     <w:uiPriority w:val="1"/>
+    <w:semiHidden/>
     <w:unhideWhenUsed/>
   </w:style>
   <w:style w:type="table" w:default="1" w:styleId="a2">

</xml_diff>